<commit_message>
docs: complete tutorial screenshots
</commit_message>
<xml_diff>
--- a/docs/tutorial/暴雪战网启动配置管理器使用教程.docx
+++ b/docs/tutorial/暴雪战网启动配置管理器使用教程.docx
@@ -802,70 +802,59 @@
         <w:t>勾选需要的选项，点击“开始安装”。</w:t>
       </w:r>
     </w:p>
-    <w:tbl>
-      <w:tblPr>
-        <w:tblW w:type="auto" w:w="0"/>
-        <w:jc w:val="center"/>
-        <w:tblLayout w:type="fixed"/>
-        <w:tblLook w:firstColumn="1" w:firstRow="1" w:lastColumn="0" w:lastRow="0" w:noHBand="0" w:noVBand="1" w:val="04A0"/>
-      </w:tblPr>
-      <w:tblGrid>
-        <w:gridCol w:w="9858"/>
-      </w:tblGrid>
-      <w:tr>
-        <w:tc>
-          <w:tcPr>
-            <w:tcW w:type="dxa" w:w="9354"/>
-            <w:shd w:fill="FAFAFA" w:val="clear"/>
-            <w:tcBorders>
-              <w:top w:val="single" w:sz="18" w:space="0" w:color="C00000"/>
-              <w:left w:val="single" w:sz="18" w:space="0" w:color="C00000"/>
-              <w:bottom w:val="single" w:sz="18" w:space="0" w:color="C00000"/>
-              <w:right w:val="single" w:sz="18" w:space="0" w:color="C00000"/>
-            </w:tcBorders>
-            <w:tcMar>
-              <w:top w:w="220" w:type="dxa"/>
-              <w:start w:w="260" w:type="dxa"/>
-              <w:bottom w:w="220" w:type="dxa"/>
-              <w:end w:w="260" w:type="dxa"/>
-            </w:tcMar>
-            <w:vAlign w:val="center"/>
-          </w:tcPr>
-          <w:p>
-            <w:pPr>
-              <w:spacing w:after="120"/>
-              <w:jc w:val="center"/>
-            </w:pPr>
-            <w:r>
-              <w:rPr>
-                <w:b/>
-                <w:color w:val="C00000"/>
-                <w:sz w:val="24"/>
-              </w:rPr>
-              <w:t>截图占位符 1：安装器主界面</w:t>
-            </w:r>
-          </w:p>
-          <w:p>
-            <w:pPr>
-              <w:spacing w:after="0"/>
-              <w:jc w:val="center"/>
-            </w:pPr>
-            <w:r>
-              <w:rPr>
-                <w:b w:val="0"/>
-                <w:color w:val="404040"/>
-                <w:sz w:val="20"/>
-              </w:rPr>
-              <w:t>请插入安装器窗口截图，并用红框标出“开始安装”按钮。</w:t>
-            </w:r>
-          </w:p>
-        </w:tc>
-      </w:tr>
-    </w:tbl>
     <w:p>
       <w:pPr>
-        <w:spacing w:after="20"/>
+        <w:spacing w:after="60"/>
+        <w:jc w:val="center"/>
       </w:pPr>
+      <w:r>
+        <w:drawing>
+          <wp:inline xmlns:a="http://schemas.openxmlformats.org/drawingml/2006/main" xmlns:pic="http://schemas.openxmlformats.org/drawingml/2006/picture">
+            <wp:extent cx="5715000" cy="3761227"/>
+            <wp:docPr id="1" name="Picture 1"/>
+            <wp:cNvGraphicFramePr>
+              <a:graphicFrameLocks noChangeAspect="1"/>
+            </wp:cNvGraphicFramePr>
+            <a:graphic>
+              <a:graphicData uri="http://schemas.openxmlformats.org/drawingml/2006/picture">
+                <pic:pic>
+                  <pic:nvPicPr>
+                    <pic:cNvPr id="0" name="WowRunner-Setup_ANiJu0DRVn.png"/>
+                    <pic:cNvPicPr/>
+                  </pic:nvPicPr>
+                  <pic:blipFill>
+                    <a:blip r:embed="rId10"/>
+                    <a:stretch>
+                      <a:fillRect/>
+                    </a:stretch>
+                  </pic:blipFill>
+                  <pic:spPr>
+                    <a:xfrm>
+                      <a:off x="0" y="0"/>
+                      <a:ext cx="5715000" cy="3761227"/>
+                    </a:xfrm>
+                    <a:prstGeom prst="rect"/>
+                  </pic:spPr>
+                </pic:pic>
+              </a:graphicData>
+            </a:graphic>
+          </wp:inline>
+        </w:drawing>
+      </w:r>
+    </w:p>
+    <w:p>
+      <w:pPr>
+        <w:spacing w:after="120"/>
+        <w:jc w:val="center"/>
+      </w:pPr>
+      <w:r>
+        <w:rPr>
+          <w:b/>
+          <w:color w:val="17365D"/>
+          <w:sz w:val="19"/>
+        </w:rPr>
+        <w:t>图 1：安装器主界面</w:t>
+      </w:r>
     </w:p>
     <w:p>
       <w:pPr>
@@ -880,70 +869,59 @@
         <w:t>安装完成后，若勾选了“安装完成后启动配置管理器”，程序会自动打开配置管理器。</w:t>
       </w:r>
     </w:p>
-    <w:tbl>
-      <w:tblPr>
-        <w:tblW w:type="auto" w:w="0"/>
-        <w:jc w:val="center"/>
-        <w:tblLayout w:type="fixed"/>
-        <w:tblLook w:firstColumn="1" w:firstRow="1" w:lastColumn="0" w:lastRow="0" w:noHBand="0" w:noVBand="1" w:val="04A0"/>
-      </w:tblPr>
-      <w:tblGrid>
-        <w:gridCol w:w="9858"/>
-      </w:tblGrid>
-      <w:tr>
-        <w:tc>
-          <w:tcPr>
-            <w:tcW w:type="dxa" w:w="9354"/>
-            <w:shd w:fill="FAFAFA" w:val="clear"/>
-            <w:tcBorders>
-              <w:top w:val="single" w:sz="18" w:space="0" w:color="C00000"/>
-              <w:left w:val="single" w:sz="18" w:space="0" w:color="C00000"/>
-              <w:bottom w:val="single" w:sz="18" w:space="0" w:color="C00000"/>
-              <w:right w:val="single" w:sz="18" w:space="0" w:color="C00000"/>
-            </w:tcBorders>
-            <w:tcMar>
-              <w:top w:w="220" w:type="dxa"/>
-              <w:start w:w="260" w:type="dxa"/>
-              <w:bottom w:w="220" w:type="dxa"/>
-              <w:end w:w="260" w:type="dxa"/>
-            </w:tcMar>
-            <w:vAlign w:val="center"/>
-          </w:tcPr>
-          <w:p>
-            <w:pPr>
-              <w:spacing w:after="120"/>
-              <w:jc w:val="center"/>
-            </w:pPr>
-            <w:r>
-              <w:rPr>
-                <w:b/>
-                <w:color w:val="C00000"/>
-                <w:sz w:val="24"/>
-              </w:rPr>
-              <w:t>截图占位符 2：安装完成后自动打开配置管理器</w:t>
-            </w:r>
-          </w:p>
-          <w:p>
-            <w:pPr>
-              <w:spacing w:after="0"/>
-              <w:jc w:val="center"/>
-            </w:pPr>
-            <w:r>
-              <w:rPr>
-                <w:b w:val="0"/>
-                <w:color w:val="404040"/>
-                <w:sz w:val="20"/>
-              </w:rPr>
-              <w:t>请插入配置管理器首次打开的截图。</w:t>
-            </w:r>
-          </w:p>
-        </w:tc>
-      </w:tr>
-    </w:tbl>
     <w:p>
       <w:pPr>
-        <w:spacing w:after="20"/>
+        <w:spacing w:after="60"/>
+        <w:jc w:val="center"/>
       </w:pPr>
+      <w:r>
+        <w:drawing>
+          <wp:inline xmlns:a="http://schemas.openxmlformats.org/drawingml/2006/main" xmlns:pic="http://schemas.openxmlformats.org/drawingml/2006/picture">
+            <wp:extent cx="5715000" cy="2905046"/>
+            <wp:docPr id="2" name="Picture 2"/>
+            <wp:cNvGraphicFramePr>
+              <a:graphicFrameLocks noChangeAspect="1"/>
+            </wp:cNvGraphicFramePr>
+            <a:graphic>
+              <a:graphicData uri="http://schemas.openxmlformats.org/drawingml/2006/picture">
+                <pic:pic>
+                  <pic:nvPicPr>
+                    <pic:cNvPr id="0" name="WowRunner_1ECyc5pHZ8.png"/>
+                    <pic:cNvPicPr/>
+                  </pic:nvPicPr>
+                  <pic:blipFill>
+                    <a:blip r:embed="rId11"/>
+                    <a:stretch>
+                      <a:fillRect/>
+                    </a:stretch>
+                  </pic:blipFill>
+                  <pic:spPr>
+                    <a:xfrm>
+                      <a:off x="0" y="0"/>
+                      <a:ext cx="5715000" cy="2905046"/>
+                    </a:xfrm>
+                    <a:prstGeom prst="rect"/>
+                  </pic:spPr>
+                </pic:pic>
+              </a:graphicData>
+            </a:graphic>
+          </wp:inline>
+        </w:drawing>
+      </w:r>
+    </w:p>
+    <w:p>
+      <w:pPr>
+        <w:spacing w:after="120"/>
+        <w:jc w:val="center"/>
+      </w:pPr>
+      <w:r>
+        <w:rPr>
+          <w:b/>
+          <w:color w:val="17365D"/>
+          <w:sz w:val="19"/>
+        </w:rPr>
+        <w:t>图 2：安装完成后自动打开配置管理器</w:t>
+      </w:r>
     </w:p>
     <w:p>
       <w:pPr>
@@ -1078,70 +1056,59 @@
         <w:t>C:\Program Files (x86)\Battle.net</w:t>
       </w:r>
     </w:p>
-    <w:tbl>
-      <w:tblPr>
-        <w:tblW w:type="auto" w:w="0"/>
-        <w:jc w:val="center"/>
-        <w:tblLayout w:type="fixed"/>
-        <w:tblLook w:firstColumn="1" w:firstRow="1" w:lastColumn="0" w:lastRow="0" w:noHBand="0" w:noVBand="1" w:val="04A0"/>
-      </w:tblPr>
-      <w:tblGrid>
-        <w:gridCol w:w="9858"/>
-      </w:tblGrid>
-      <w:tr>
-        <w:tc>
-          <w:tcPr>
-            <w:tcW w:type="dxa" w:w="9354"/>
-            <w:shd w:fill="FAFAFA" w:val="clear"/>
-            <w:tcBorders>
-              <w:top w:val="single" w:sz="18" w:space="0" w:color="C00000"/>
-              <w:left w:val="single" w:sz="18" w:space="0" w:color="C00000"/>
-              <w:bottom w:val="single" w:sz="18" w:space="0" w:color="C00000"/>
-              <w:right w:val="single" w:sz="18" w:space="0" w:color="C00000"/>
-            </w:tcBorders>
-            <w:tcMar>
-              <w:top w:w="220" w:type="dxa"/>
-              <w:start w:w="260" w:type="dxa"/>
-              <w:bottom w:w="220" w:type="dxa"/>
-              <w:end w:w="260" w:type="dxa"/>
-            </w:tcMar>
-            <w:vAlign w:val="center"/>
-          </w:tcPr>
-          <w:p>
-            <w:pPr>
-              <w:spacing w:after="120"/>
-              <w:jc w:val="center"/>
-            </w:pPr>
-            <w:r>
-              <w:rPr>
-                <w:b/>
-                <w:color w:val="C00000"/>
-                <w:sz w:val="24"/>
-              </w:rPr>
-              <w:t>截图占位符 3：修改程序路径</w:t>
-            </w:r>
-          </w:p>
-          <w:p>
-            <w:pPr>
-              <w:spacing w:after="0"/>
-              <w:jc w:val="center"/>
-            </w:pPr>
-            <w:r>
-              <w:rPr>
-                <w:b w:val="0"/>
-                <w:color w:val="404040"/>
-                <w:sz w:val="20"/>
-              </w:rPr>
-              <w:t>请插入配置器截图，并用红框圈出“程序路径”输入框和“浏览”按钮。</w:t>
-            </w:r>
-          </w:p>
-        </w:tc>
-      </w:tr>
-    </w:tbl>
     <w:p>
       <w:pPr>
-        <w:spacing w:after="20"/>
+        <w:spacing w:after="60"/>
+        <w:jc w:val="center"/>
       </w:pPr>
+      <w:r>
+        <w:drawing>
+          <wp:inline xmlns:a="http://schemas.openxmlformats.org/drawingml/2006/main" xmlns:pic="http://schemas.openxmlformats.org/drawingml/2006/picture">
+            <wp:extent cx="5715000" cy="4390376"/>
+            <wp:docPr id="3" name="Picture 3"/>
+            <wp:cNvGraphicFramePr>
+              <a:graphicFrameLocks noChangeAspect="1"/>
+            </wp:cNvGraphicFramePr>
+            <a:graphic>
+              <a:graphicData uri="http://schemas.openxmlformats.org/drawingml/2006/picture">
+                <pic:pic>
+                  <pic:nvPicPr>
+                    <pic:cNvPr id="0" name="WowRunner_1THewb1glJ.png"/>
+                    <pic:cNvPicPr/>
+                  </pic:nvPicPr>
+                  <pic:blipFill>
+                    <a:blip r:embed="rId12"/>
+                    <a:stretch>
+                      <a:fillRect/>
+                    </a:stretch>
+                  </pic:blipFill>
+                  <pic:spPr>
+                    <a:xfrm>
+                      <a:off x="0" y="0"/>
+                      <a:ext cx="5715000" cy="4390376"/>
+                    </a:xfrm>
+                    <a:prstGeom prst="rect"/>
+                  </pic:spPr>
+                </pic:pic>
+              </a:graphicData>
+            </a:graphic>
+          </wp:inline>
+        </w:drawing>
+      </w:r>
+    </w:p>
+    <w:p>
+      <w:pPr>
+        <w:spacing w:after="120"/>
+        <w:jc w:val="center"/>
+      </w:pPr>
+      <w:r>
+        <w:rPr>
+          <w:b/>
+          <w:color w:val="17365D"/>
+          <w:sz w:val="19"/>
+        </w:rPr>
+        <w:t>图 3：修改程序路径</w:t>
+      </w:r>
     </w:p>
     <w:p>
       <w:pPr>
@@ -1315,70 +1282,59 @@
         <w:spacing w:after="20"/>
       </w:pPr>
     </w:p>
-    <w:tbl>
-      <w:tblPr>
-        <w:tblW w:type="auto" w:w="0"/>
-        <w:jc w:val="center"/>
-        <w:tblLayout w:type="fixed"/>
-        <w:tblLook w:firstColumn="1" w:firstRow="1" w:lastColumn="0" w:lastRow="0" w:noHBand="0" w:noVBand="1" w:val="04A0"/>
-      </w:tblPr>
-      <w:tblGrid>
-        <w:gridCol w:w="9858"/>
-      </w:tblGrid>
-      <w:tr>
-        <w:tc>
-          <w:tcPr>
-            <w:tcW w:type="dxa" w:w="9354"/>
-            <w:shd w:fill="FAFAFA" w:val="clear"/>
-            <w:tcBorders>
-              <w:top w:val="single" w:sz="18" w:space="0" w:color="C00000"/>
-              <w:left w:val="single" w:sz="18" w:space="0" w:color="C00000"/>
-              <w:bottom w:val="single" w:sz="18" w:space="0" w:color="C00000"/>
-              <w:right w:val="single" w:sz="18" w:space="0" w:color="C00000"/>
-            </w:tcBorders>
-            <w:tcMar>
-              <w:top w:w="220" w:type="dxa"/>
-              <w:start w:w="260" w:type="dxa"/>
-              <w:bottom w:w="220" w:type="dxa"/>
-              <w:end w:w="260" w:type="dxa"/>
-            </w:tcMar>
-            <w:vAlign w:val="center"/>
-          </w:tcPr>
-          <w:p>
-            <w:pPr>
-              <w:spacing w:after="120"/>
-              <w:jc w:val="center"/>
-            </w:pPr>
-            <w:r>
-              <w:rPr>
-                <w:b/>
-                <w:color w:val="C00000"/>
-                <w:sz w:val="24"/>
-              </w:rPr>
-              <w:t>截图占位符 4：输入密码并保存用户配置</w:t>
-            </w:r>
-          </w:p>
-          <w:p>
-            <w:pPr>
-              <w:spacing w:after="0"/>
-              <w:jc w:val="center"/>
-            </w:pPr>
-            <w:r>
-              <w:rPr>
-                <w:b w:val="0"/>
-                <w:color w:val="404040"/>
-                <w:sz w:val="20"/>
-              </w:rPr>
-              <w:t>请插入配置器截图，用红框分别标出密码输入框和“保存用户配置”按钮。</w:t>
-            </w:r>
-          </w:p>
-        </w:tc>
-      </w:tr>
-    </w:tbl>
     <w:p>
       <w:pPr>
-        <w:spacing w:after="20"/>
+        <w:spacing w:after="60"/>
+        <w:jc w:val="center"/>
       </w:pPr>
+      <w:r>
+        <w:drawing>
+          <wp:inline xmlns:a="http://schemas.openxmlformats.org/drawingml/2006/main" xmlns:pic="http://schemas.openxmlformats.org/drawingml/2006/picture">
+            <wp:extent cx="5715000" cy="2905046"/>
+            <wp:docPr id="4" name="Picture 4"/>
+            <wp:cNvGraphicFramePr>
+              <a:graphicFrameLocks noChangeAspect="1"/>
+            </wp:cNvGraphicFramePr>
+            <a:graphic>
+              <a:graphicData uri="http://schemas.openxmlformats.org/drawingml/2006/picture">
+                <pic:pic>
+                  <pic:nvPicPr>
+                    <pic:cNvPr id="0" name="WowRunner_zEVJV0GtTW.png"/>
+                    <pic:cNvPicPr/>
+                  </pic:nvPicPr>
+                  <pic:blipFill>
+                    <a:blip r:embed="rId13"/>
+                    <a:stretch>
+                      <a:fillRect/>
+                    </a:stretch>
+                  </pic:blipFill>
+                  <pic:spPr>
+                    <a:xfrm>
+                      <a:off x="0" y="0"/>
+                      <a:ext cx="5715000" cy="2905046"/>
+                    </a:xfrm>
+                    <a:prstGeom prst="rect"/>
+                  </pic:spPr>
+                </pic:pic>
+              </a:graphicData>
+            </a:graphic>
+          </wp:inline>
+        </w:drawing>
+      </w:r>
+    </w:p>
+    <w:p>
+      <w:pPr>
+        <w:spacing w:after="120"/>
+        <w:jc w:val="center"/>
+      </w:pPr>
+      <w:r>
+        <w:rPr>
+          <w:b/>
+          <w:color w:val="17365D"/>
+          <w:sz w:val="19"/>
+        </w:rPr>
+        <w:t>图 4：输入密码并保存用户配置</w:t>
+      </w:r>
     </w:p>
     <w:p>
       <w:pPr>
@@ -1452,135 +1408,113 @@
         <w:t>初始化只支持本机 Windows 用户，不支持域账号。</w:t>
       </w:r>
     </w:p>
-    <w:tbl>
-      <w:tblPr>
-        <w:tblW w:type="auto" w:w="0"/>
-        <w:jc w:val="center"/>
-        <w:tblLayout w:type="fixed"/>
-        <w:tblLook w:firstColumn="1" w:firstRow="1" w:lastColumn="0" w:lastRow="0" w:noHBand="0" w:noVBand="1" w:val="04A0"/>
-      </w:tblPr>
-      <w:tblGrid>
-        <w:gridCol w:w="9858"/>
-      </w:tblGrid>
-      <w:tr>
-        <w:tc>
-          <w:tcPr>
-            <w:tcW w:type="dxa" w:w="9354"/>
-            <w:shd w:fill="FAFAFA" w:val="clear"/>
-            <w:tcBorders>
-              <w:top w:val="single" w:sz="18" w:space="0" w:color="C00000"/>
-              <w:left w:val="single" w:sz="18" w:space="0" w:color="C00000"/>
-              <w:bottom w:val="single" w:sz="18" w:space="0" w:color="C00000"/>
-              <w:right w:val="single" w:sz="18" w:space="0" w:color="C00000"/>
-            </w:tcBorders>
-            <w:tcMar>
-              <w:top w:w="220" w:type="dxa"/>
-              <w:start w:w="260" w:type="dxa"/>
-              <w:bottom w:w="220" w:type="dxa"/>
-              <w:end w:w="260" w:type="dxa"/>
-            </w:tcMar>
-            <w:vAlign w:val="center"/>
-          </w:tcPr>
-          <w:p>
-            <w:pPr>
-              <w:spacing w:after="120"/>
-              <w:jc w:val="center"/>
-            </w:pPr>
-            <w:r>
-              <w:rPr>
-                <w:b/>
-                <w:color w:val="C00000"/>
-                <w:sz w:val="24"/>
-              </w:rPr>
-              <w:t>截图占位符 5：初始化 Windows 账号按钮</w:t>
-            </w:r>
-          </w:p>
-          <w:p>
-            <w:pPr>
-              <w:spacing w:after="0"/>
-              <w:jc w:val="center"/>
-            </w:pPr>
-            <w:r>
-              <w:rPr>
-                <w:b w:val="0"/>
-                <w:color w:val="404040"/>
-                <w:sz w:val="20"/>
-              </w:rPr>
-              <w:t>请插入配置器截图，用红框标出“初始化 Windows 账号”按钮。</w:t>
-            </w:r>
-          </w:p>
-        </w:tc>
-      </w:tr>
-    </w:tbl>
     <w:p>
       <w:pPr>
-        <w:spacing w:after="20"/>
+        <w:spacing w:after="60"/>
+        <w:jc w:val="center"/>
       </w:pPr>
+      <w:r>
+        <w:drawing>
+          <wp:inline xmlns:a="http://schemas.openxmlformats.org/drawingml/2006/main" xmlns:pic="http://schemas.openxmlformats.org/drawingml/2006/picture">
+            <wp:extent cx="5715000" cy="2905046"/>
+            <wp:docPr id="5" name="Picture 5"/>
+            <wp:cNvGraphicFramePr>
+              <a:graphicFrameLocks noChangeAspect="1"/>
+            </wp:cNvGraphicFramePr>
+            <a:graphic>
+              <a:graphicData uri="http://schemas.openxmlformats.org/drawingml/2006/picture">
+                <pic:pic>
+                  <pic:nvPicPr>
+                    <pic:cNvPr id="0" name="WowRunner_1ECyc5pHZ8.png"/>
+                    <pic:cNvPicPr/>
+                  </pic:nvPicPr>
+                  <pic:blipFill>
+                    <a:blip r:embed="rId11"/>
+                    <a:stretch>
+                      <a:fillRect/>
+                    </a:stretch>
+                  </pic:blipFill>
+                  <pic:spPr>
+                    <a:xfrm>
+                      <a:off x="0" y="0"/>
+                      <a:ext cx="5715000" cy="2905046"/>
+                    </a:xfrm>
+                    <a:prstGeom prst="rect"/>
+                  </pic:spPr>
+                </pic:pic>
+              </a:graphicData>
+            </a:graphic>
+          </wp:inline>
+        </w:drawing>
+      </w:r>
     </w:p>
-    <w:tbl>
-      <w:tblPr>
-        <w:tblW w:type="auto" w:w="0"/>
-        <w:jc w:val="center"/>
-        <w:tblLayout w:type="fixed"/>
-        <w:tblLook w:firstColumn="1" w:firstRow="1" w:lastColumn="0" w:lastRow="0" w:noHBand="0" w:noVBand="1" w:val="04A0"/>
-      </w:tblPr>
-      <w:tblGrid>
-        <w:gridCol w:w="9858"/>
-      </w:tblGrid>
-      <w:tr>
-        <w:tc>
-          <w:tcPr>
-            <w:tcW w:type="dxa" w:w="9354"/>
-            <w:shd w:fill="FAFAFA" w:val="clear"/>
-            <w:tcBorders>
-              <w:top w:val="single" w:sz="18" w:space="0" w:color="C00000"/>
-              <w:left w:val="single" w:sz="18" w:space="0" w:color="C00000"/>
-              <w:bottom w:val="single" w:sz="18" w:space="0" w:color="C00000"/>
-              <w:right w:val="single" w:sz="18" w:space="0" w:color="C00000"/>
-            </w:tcBorders>
-            <w:tcMar>
-              <w:top w:w="220" w:type="dxa"/>
-              <w:start w:w="260" w:type="dxa"/>
-              <w:bottom w:w="220" w:type="dxa"/>
-              <w:end w:w="260" w:type="dxa"/>
-            </w:tcMar>
-            <w:vAlign w:val="center"/>
-          </w:tcPr>
-          <w:p>
-            <w:pPr>
-              <w:spacing w:after="120"/>
-              <w:jc w:val="center"/>
-            </w:pPr>
-            <w:r>
-              <w:rPr>
-                <w:b/>
-                <w:color w:val="C00000"/>
-                <w:sz w:val="24"/>
-              </w:rPr>
-              <w:t>截图占位符 6：管理员权限确认或密码输入窗口</w:t>
-            </w:r>
-          </w:p>
-          <w:p>
-            <w:pPr>
-              <w:spacing w:after="0"/>
-              <w:jc w:val="center"/>
-            </w:pPr>
-            <w:r>
-              <w:rPr>
-                <w:b w:val="0"/>
-                <w:color w:val="404040"/>
-                <w:sz w:val="20"/>
-              </w:rPr>
-              <w:t>请插入 UAC 或密码输入窗口截图。若系统没有再次询问密码，可将此处替换为“使用已保存凭据完成初始化”的截图。</w:t>
-            </w:r>
-          </w:p>
-        </w:tc>
-      </w:tr>
-    </w:tbl>
     <w:p>
       <w:pPr>
-        <w:spacing w:after="20"/>
+        <w:spacing w:after="120"/>
+        <w:jc w:val="center"/>
       </w:pPr>
+      <w:r>
+        <w:rPr>
+          <w:b/>
+          <w:color w:val="17365D"/>
+          <w:sz w:val="19"/>
+        </w:rPr>
+        <w:t>图 5：初始化 Windows 账号按钮</w:t>
+      </w:r>
+    </w:p>
+    <w:p>
+      <w:pPr>
+        <w:spacing w:after="60"/>
+        <w:jc w:val="center"/>
+      </w:pPr>
+      <w:r>
+        <w:drawing>
+          <wp:inline xmlns:a="http://schemas.openxmlformats.org/drawingml/2006/main" xmlns:pic="http://schemas.openxmlformats.org/drawingml/2006/picture">
+            <wp:extent cx="5715000" cy="2520531"/>
+            <wp:docPr id="6" name="Picture 6"/>
+            <wp:cNvGraphicFramePr>
+              <a:graphicFrameLocks noChangeAspect="1"/>
+            </wp:cNvGraphicFramePr>
+            <a:graphic>
+              <a:graphicData uri="http://schemas.openxmlformats.org/drawingml/2006/picture">
+                <pic:pic>
+                  <pic:nvPicPr>
+                    <pic:cNvPr id="0" name="WowRunner_pTz5CTAKZ0.png"/>
+                    <pic:cNvPicPr/>
+                  </pic:nvPicPr>
+                  <pic:blipFill>
+                    <a:blip r:embed="rId14"/>
+                    <a:stretch>
+                      <a:fillRect/>
+                    </a:stretch>
+                  </pic:blipFill>
+                  <pic:spPr>
+                    <a:xfrm>
+                      <a:off x="0" y="0"/>
+                      <a:ext cx="5715000" cy="2520531"/>
+                    </a:xfrm>
+                    <a:prstGeom prst="rect"/>
+                  </pic:spPr>
+                </pic:pic>
+              </a:graphicData>
+            </a:graphic>
+          </wp:inline>
+        </w:drawing>
+      </w:r>
+    </w:p>
+    <w:p>
+      <w:pPr>
+        <w:spacing w:after="120"/>
+        <w:jc w:val="center"/>
+      </w:pPr>
+      <w:r>
+        <w:rPr>
+          <w:b/>
+          <w:color w:val="17365D"/>
+          <w:sz w:val="19"/>
+        </w:rPr>
+        <w:t>图 6：管理员权限确认或密码输入窗口</w:t>
+      </w:r>
     </w:p>
     <w:tbl>
       <w:tblPr>
@@ -1717,135 +1651,113 @@
         <w:t>不同 profile 可以创建多个快捷方式。</w:t>
       </w:r>
     </w:p>
-    <w:tbl>
-      <w:tblPr>
-        <w:tblW w:type="auto" w:w="0"/>
-        <w:jc w:val="center"/>
-        <w:tblLayout w:type="fixed"/>
-        <w:tblLook w:firstColumn="1" w:firstRow="1" w:lastColumn="0" w:lastRow="0" w:noHBand="0" w:noVBand="1" w:val="04A0"/>
-      </w:tblPr>
-      <w:tblGrid>
-        <w:gridCol w:w="9858"/>
-      </w:tblGrid>
-      <w:tr>
-        <w:tc>
-          <w:tcPr>
-            <w:tcW w:type="dxa" w:w="9354"/>
-            <w:shd w:fill="FAFAFA" w:val="clear"/>
-            <w:tcBorders>
-              <w:top w:val="single" w:sz="18" w:space="0" w:color="C00000"/>
-              <w:left w:val="single" w:sz="18" w:space="0" w:color="C00000"/>
-              <w:bottom w:val="single" w:sz="18" w:space="0" w:color="C00000"/>
-              <w:right w:val="single" w:sz="18" w:space="0" w:color="C00000"/>
-            </w:tcBorders>
-            <w:tcMar>
-              <w:top w:w="220" w:type="dxa"/>
-              <w:start w:w="260" w:type="dxa"/>
-              <w:bottom w:w="220" w:type="dxa"/>
-              <w:end w:w="260" w:type="dxa"/>
-            </w:tcMar>
-            <w:vAlign w:val="center"/>
-          </w:tcPr>
-          <w:p>
-            <w:pPr>
-              <w:spacing w:after="120"/>
-              <w:jc w:val="center"/>
-            </w:pPr>
-            <w:r>
-              <w:rPr>
-                <w:b/>
-                <w:color w:val="C00000"/>
-                <w:sz w:val="24"/>
-              </w:rPr>
-              <w:t>截图占位符 7：创建桌面快捷方式按钮</w:t>
-            </w:r>
-          </w:p>
-          <w:p>
-            <w:pPr>
-              <w:spacing w:after="0"/>
-              <w:jc w:val="center"/>
-            </w:pPr>
-            <w:r>
-              <w:rPr>
-                <w:b w:val="0"/>
-                <w:color w:val="404040"/>
-                <w:sz w:val="20"/>
-              </w:rPr>
-              <w:t>请插入配置器截图，用红框标出“创建桌面快捷方式”按钮。</w:t>
-            </w:r>
-          </w:p>
-        </w:tc>
-      </w:tr>
-    </w:tbl>
     <w:p>
       <w:pPr>
-        <w:spacing w:after="20"/>
+        <w:spacing w:after="60"/>
+        <w:jc w:val="center"/>
       </w:pPr>
+      <w:r>
+        <w:drawing>
+          <wp:inline xmlns:a="http://schemas.openxmlformats.org/drawingml/2006/main" xmlns:pic="http://schemas.openxmlformats.org/drawingml/2006/picture">
+            <wp:extent cx="5715000" cy="2905046"/>
+            <wp:docPr id="7" name="Picture 7"/>
+            <wp:cNvGraphicFramePr>
+              <a:graphicFrameLocks noChangeAspect="1"/>
+            </wp:cNvGraphicFramePr>
+            <a:graphic>
+              <a:graphicData uri="http://schemas.openxmlformats.org/drawingml/2006/picture">
+                <pic:pic>
+                  <pic:nvPicPr>
+                    <pic:cNvPr id="0" name="WowRunner_annotated.png"/>
+                    <pic:cNvPicPr/>
+                  </pic:nvPicPr>
+                  <pic:blipFill>
+                    <a:blip r:embed="rId15"/>
+                    <a:stretch>
+                      <a:fillRect/>
+                    </a:stretch>
+                  </pic:blipFill>
+                  <pic:spPr>
+                    <a:xfrm>
+                      <a:off x="0" y="0"/>
+                      <a:ext cx="5715000" cy="2905046"/>
+                    </a:xfrm>
+                    <a:prstGeom prst="rect"/>
+                  </pic:spPr>
+                </pic:pic>
+              </a:graphicData>
+            </a:graphic>
+          </wp:inline>
+        </w:drawing>
+      </w:r>
     </w:p>
-    <w:tbl>
-      <w:tblPr>
-        <w:tblW w:type="auto" w:w="0"/>
-        <w:jc w:val="center"/>
-        <w:tblLayout w:type="fixed"/>
-        <w:tblLook w:firstColumn="1" w:firstRow="1" w:lastColumn="0" w:lastRow="0" w:noHBand="0" w:noVBand="1" w:val="04A0"/>
-      </w:tblPr>
-      <w:tblGrid>
-        <w:gridCol w:w="9858"/>
-      </w:tblGrid>
-      <w:tr>
-        <w:tc>
-          <w:tcPr>
-            <w:tcW w:type="dxa" w:w="9354"/>
-            <w:shd w:fill="FAFAFA" w:val="clear"/>
-            <w:tcBorders>
-              <w:top w:val="single" w:sz="18" w:space="0" w:color="C00000"/>
-              <w:left w:val="single" w:sz="18" w:space="0" w:color="C00000"/>
-              <w:bottom w:val="single" w:sz="18" w:space="0" w:color="C00000"/>
-              <w:right w:val="single" w:sz="18" w:space="0" w:color="C00000"/>
-            </w:tcBorders>
-            <w:tcMar>
-              <w:top w:w="220" w:type="dxa"/>
-              <w:start w:w="260" w:type="dxa"/>
-              <w:bottom w:w="220" w:type="dxa"/>
-              <w:end w:w="260" w:type="dxa"/>
-            </w:tcMar>
-            <w:vAlign w:val="center"/>
-          </w:tcPr>
-          <w:p>
-            <w:pPr>
-              <w:spacing w:after="120"/>
-              <w:jc w:val="center"/>
-            </w:pPr>
-            <w:r>
-              <w:rPr>
-                <w:b/>
-                <w:color w:val="C00000"/>
-                <w:sz w:val="24"/>
-              </w:rPr>
-              <w:t>截图占位符 8：桌面上的快捷方式</w:t>
-            </w:r>
-          </w:p>
-          <w:p>
-            <w:pPr>
-              <w:spacing w:after="0"/>
-              <w:jc w:val="center"/>
-            </w:pPr>
-            <w:r>
-              <w:rPr>
-                <w:b w:val="0"/>
-                <w:color w:val="404040"/>
-                <w:sz w:val="20"/>
-              </w:rPr>
-              <w:t>请插入桌面截图，用红框标出新生成的“暴雪战网 - 用户配置名”快捷方式。</w:t>
-            </w:r>
-          </w:p>
-        </w:tc>
-      </w:tr>
-    </w:tbl>
     <w:p>
       <w:pPr>
-        <w:spacing w:after="20"/>
+        <w:spacing w:after="120"/>
+        <w:jc w:val="center"/>
       </w:pPr>
+      <w:r>
+        <w:rPr>
+          <w:b/>
+          <w:color w:val="17365D"/>
+          <w:sz w:val="19"/>
+        </w:rPr>
+        <w:t>图 7：创建桌面快捷方式按钮</w:t>
+      </w:r>
+    </w:p>
+    <w:p>
+      <w:pPr>
+        <w:spacing w:after="60"/>
+        <w:jc w:val="center"/>
+      </w:pPr>
+      <w:r>
+        <w:drawing>
+          <wp:inline xmlns:a="http://schemas.openxmlformats.org/drawingml/2006/main" xmlns:pic="http://schemas.openxmlformats.org/drawingml/2006/picture">
+            <wp:extent cx="5715000" cy="6636774"/>
+            <wp:docPr id="8" name="Picture 8"/>
+            <wp:cNvGraphicFramePr>
+              <a:graphicFrameLocks noChangeAspect="1"/>
+            </wp:cNvGraphicFramePr>
+            <a:graphic>
+              <a:graphicData uri="http://schemas.openxmlformats.org/drawingml/2006/picture">
+                <pic:pic>
+                  <pic:nvPicPr>
+                    <pic:cNvPr id="0" name="explorer_3mPMngZQMB.png"/>
+                    <pic:cNvPicPr/>
+                  </pic:nvPicPr>
+                  <pic:blipFill>
+                    <a:blip r:embed="rId16"/>
+                    <a:stretch>
+                      <a:fillRect/>
+                    </a:stretch>
+                  </pic:blipFill>
+                  <pic:spPr>
+                    <a:xfrm>
+                      <a:off x="0" y="0"/>
+                      <a:ext cx="5715000" cy="6636774"/>
+                    </a:xfrm>
+                    <a:prstGeom prst="rect"/>
+                  </pic:spPr>
+                </pic:pic>
+              </a:graphicData>
+            </a:graphic>
+          </wp:inline>
+        </w:drawing>
+      </w:r>
+    </w:p>
+    <w:p>
+      <w:pPr>
+        <w:spacing w:after="120"/>
+        <w:jc w:val="center"/>
+      </w:pPr>
+      <w:r>
+        <w:rPr>
+          <w:b/>
+          <w:color w:val="17365D"/>
+          <w:sz w:val="19"/>
+        </w:rPr>
+        <w:t>图 8：桌面上的快捷方式</w:t>
+      </w:r>
     </w:p>
     <w:p>
       <w:pPr>
@@ -1906,70 +1818,59 @@
         <w:t>如果同时运行了其他 Battle.net 或 Agent 进程，Battle.net 可能会复用已有会话。测试不同 Windows 用户时，建议先关闭已有的 Battle.net、Agent 和 WoW 进程。</w:t>
       </w:r>
     </w:p>
-    <w:tbl>
-      <w:tblPr>
-        <w:tblW w:type="auto" w:w="0"/>
-        <w:jc w:val="center"/>
-        <w:tblLayout w:type="fixed"/>
-        <w:tblLook w:firstColumn="1" w:firstRow="1" w:lastColumn="0" w:lastRow="0" w:noHBand="0" w:noVBand="1" w:val="04A0"/>
-      </w:tblPr>
-      <w:tblGrid>
-        <w:gridCol w:w="9858"/>
-      </w:tblGrid>
-      <w:tr>
-        <w:tc>
-          <w:tcPr>
-            <w:tcW w:type="dxa" w:w="9354"/>
-            <w:shd w:fill="FAFAFA" w:val="clear"/>
-            <w:tcBorders>
-              <w:top w:val="single" w:sz="18" w:space="0" w:color="C00000"/>
-              <w:left w:val="single" w:sz="18" w:space="0" w:color="C00000"/>
-              <w:bottom w:val="single" w:sz="18" w:space="0" w:color="C00000"/>
-              <w:right w:val="single" w:sz="18" w:space="0" w:color="C00000"/>
-            </w:tcBorders>
-            <w:tcMar>
-              <w:top w:w="220" w:type="dxa"/>
-              <w:start w:w="260" w:type="dxa"/>
-              <w:bottom w:w="220" w:type="dxa"/>
-              <w:end w:w="260" w:type="dxa"/>
-            </w:tcMar>
-            <w:vAlign w:val="center"/>
-          </w:tcPr>
-          <w:p>
-            <w:pPr>
-              <w:spacing w:after="120"/>
-              <w:jc w:val="center"/>
-            </w:pPr>
-            <w:r>
-              <w:rPr>
-                <w:b/>
-                <w:color w:val="C00000"/>
-                <w:sz w:val="24"/>
-              </w:rPr>
-              <w:t>截图占位符 9：启动当前配置</w:t>
-            </w:r>
-          </w:p>
-          <w:p>
-            <w:pPr>
-              <w:spacing w:after="0"/>
-              <w:jc w:val="center"/>
-            </w:pPr>
-            <w:r>
-              <w:rPr>
-                <w:b w:val="0"/>
-                <w:color w:val="404040"/>
-                <w:sz w:val="20"/>
-              </w:rPr>
-              <w:t>请插入点击“启动当前配置”后的截图，或插入 Battle.net 启动成功截图。</w:t>
-            </w:r>
-          </w:p>
-        </w:tc>
-      </w:tr>
-    </w:tbl>
     <w:p>
       <w:pPr>
-        <w:spacing w:after="20"/>
+        <w:spacing w:after="60"/>
+        <w:jc w:val="center"/>
       </w:pPr>
+      <w:r>
+        <w:drawing>
+          <wp:inline xmlns:a="http://schemas.openxmlformats.org/drawingml/2006/main" xmlns:pic="http://schemas.openxmlformats.org/drawingml/2006/picture">
+            <wp:extent cx="5715000" cy="9651298"/>
+            <wp:docPr id="9" name="Picture 9"/>
+            <wp:cNvGraphicFramePr>
+              <a:graphicFrameLocks noChangeAspect="1"/>
+            </wp:cNvGraphicFramePr>
+            <a:graphic>
+              <a:graphicData uri="http://schemas.openxmlformats.org/drawingml/2006/picture">
+                <pic:pic>
+                  <pic:nvPicPr>
+                    <pic:cNvPr id="0" name="Battle.net_1Kr1c2R2NE.png"/>
+                    <pic:cNvPicPr/>
+                  </pic:nvPicPr>
+                  <pic:blipFill>
+                    <a:blip r:embed="rId17"/>
+                    <a:stretch>
+                      <a:fillRect/>
+                    </a:stretch>
+                  </pic:blipFill>
+                  <pic:spPr>
+                    <a:xfrm>
+                      <a:off x="0" y="0"/>
+                      <a:ext cx="5715000" cy="9651298"/>
+                    </a:xfrm>
+                    <a:prstGeom prst="rect"/>
+                  </pic:spPr>
+                </pic:pic>
+              </a:graphicData>
+            </a:graphic>
+          </wp:inline>
+        </w:drawing>
+      </w:r>
+    </w:p>
+    <w:p>
+      <w:pPr>
+        <w:spacing w:after="120"/>
+        <w:jc w:val="center"/>
+      </w:pPr>
+      <w:r>
+        <w:rPr>
+          <w:b/>
+          <w:color w:val="17365D"/>
+          <w:sz w:val="19"/>
+        </w:rPr>
+        <w:t>图 9：Battle.net 目标程序图标</w:t>
+      </w:r>
     </w:p>
     <w:p>
       <w:pPr>

</xml_diff>